<commit_message>
modified details in nottbook
</commit_message>
<xml_diff>
--- a/Skin_Cancer_Simple_Workflow.docx
+++ b/Skin_Cancer_Simple_Workflow.docx
@@ -495,7 +495,15 @@
     </w:p>
     <w:p>
       <w:r>
-        <w:t xml:space="preserve">Use TensorFlow and </w:t>
+        <w:t xml:space="preserve">Use </w:t>
+      </w:r>
+      <w:proofErr w:type="spellStart"/>
+      <w:r>
+        <w:t>TensorFlow</w:t>
+      </w:r>
+      <w:proofErr w:type="spellEnd"/>
+      <w:r>
+        <w:t xml:space="preserve"> and </w:t>
       </w:r>
       <w:proofErr w:type="spellStart"/>
       <w:r>
@@ -730,9 +738,75 @@
         <w:t>If the dataset is not cleaned properly or the images are not prepared correctly, the model accuracy can become low. A good training process helps the app give more reliable prediction results.</w:t>
       </w:r>
     </w:p>
+    <w:p>
+      <w:r>
+        <w:rPr>
+          <w:noProof/>
+          <w:lang w:val="en-GB" w:eastAsia="en-GB" w:bidi="si-LK"/>
+        </w:rPr>
+        <w:drawing>
+          <wp:anchor distT="0" distB="0" distL="114300" distR="114300" simplePos="0" relativeHeight="251687936" behindDoc="0" locked="0" layoutInCell="1" allowOverlap="1" wp14:anchorId="70CAA0B2" wp14:editId="2883CBF8">
+            <wp:simplePos x="0" y="0"/>
+            <wp:positionH relativeFrom="column">
+              <wp:posOffset>-6668</wp:posOffset>
+            </wp:positionH>
+            <wp:positionV relativeFrom="paragraph">
+              <wp:posOffset>199708</wp:posOffset>
+            </wp:positionV>
+            <wp:extent cx="6188710" cy="2914650"/>
+            <wp:effectExtent l="0" t="0" r="2540" b="0"/>
+            <wp:wrapNone/>
+            <wp:docPr id="11" name="Picture 11" descr="F:\Screenshot from 2026-04-05 17-55-52.png"/>
+            <wp:cNvGraphicFramePr>
+              <a:graphicFrameLocks xmlns:a="http://schemas.openxmlformats.org/drawingml/2006/main" noChangeAspect="1"/>
+            </wp:cNvGraphicFramePr>
+            <a:graphic xmlns:a="http://schemas.openxmlformats.org/drawingml/2006/main">
+              <a:graphicData uri="http://schemas.openxmlformats.org/drawingml/2006/picture">
+                <pic:pic xmlns:pic="http://schemas.openxmlformats.org/drawingml/2006/picture">
+                  <pic:nvPicPr>
+                    <pic:cNvPr id="0" name="Picture 10" descr="F:\Screenshot from 2026-04-05 17-55-52.png"/>
+                    <pic:cNvPicPr>
+                      <a:picLocks noChangeAspect="1" noChangeArrowheads="1"/>
+                    </pic:cNvPicPr>
+                  </pic:nvPicPr>
+                  <pic:blipFill>
+                    <a:blip r:embed="rId11">
+                      <a:extLst>
+                        <a:ext uri="{28A0092B-C50C-407E-A947-70E740481C1C}">
+                          <a14:useLocalDpi xmlns:a14="http://schemas.microsoft.com/office/drawing/2010/main" val="0"/>
+                        </a:ext>
+                      </a:extLst>
+                    </a:blip>
+                    <a:srcRect/>
+                    <a:stretch>
+                      <a:fillRect/>
+                    </a:stretch>
+                  </pic:blipFill>
+                  <pic:spPr bwMode="auto">
+                    <a:xfrm>
+                      <a:off x="0" y="0"/>
+                      <a:ext cx="6188710" cy="2914650"/>
+                    </a:xfrm>
+                    <a:prstGeom prst="rect">
+                      <a:avLst/>
+                    </a:prstGeom>
+                    <a:noFill/>
+                    <a:ln>
+                      <a:noFill/>
+                    </a:ln>
+                  </pic:spPr>
+                </pic:pic>
+              </a:graphicData>
+            </a:graphic>
+          </wp:anchor>
+        </w:drawing>
+      </w:r>
+    </w:p>
     <w:p/>
-    <w:p/>
-    <w:p/>
+    <w:p>
+      <w:bookmarkStart w:id="0" w:name="_GoBack"/>
+      <w:bookmarkEnd w:id="0"/>
+    </w:p>
     <w:p/>
     <w:p/>
     <w:p/>
@@ -863,12 +937,374 @@
         <w:t>The frontend is the user interface of the project. It allows the user to select or capture a skin image and view the AI prediction result in a simple mobile screen.</w:t>
       </w:r>
     </w:p>
+    <w:p>
+      <w:r>
+        <w:rPr>
+          <w:noProof/>
+          <w:lang w:val="en-GB" w:eastAsia="en-GB" w:bidi="si-LK"/>
+        </w:rPr>
+        <w:drawing>
+          <wp:anchor distT="0" distB="0" distL="114300" distR="114300" simplePos="0" relativeHeight="251657216" behindDoc="0" locked="0" layoutInCell="1" allowOverlap="1" wp14:anchorId="1CA53281" wp14:editId="088F32CB">
+            <wp:simplePos x="0" y="0"/>
+            <wp:positionH relativeFrom="column">
+              <wp:posOffset>4432619</wp:posOffset>
+            </wp:positionH>
+            <wp:positionV relativeFrom="paragraph">
+              <wp:posOffset>5080</wp:posOffset>
+            </wp:positionV>
+            <wp:extent cx="1793286" cy="3985895"/>
+            <wp:effectExtent l="0" t="0" r="0" b="0"/>
+            <wp:wrapNone/>
+            <wp:docPr id="8" name="Picture 8" descr="C:\Users\msi\Downloads\DermSCan ss\WhatsApp Image 2026-04-05 at 20.39.12 (1).jpeg"/>
+            <wp:cNvGraphicFramePr>
+              <a:graphicFrameLocks xmlns:a="http://schemas.openxmlformats.org/drawingml/2006/main" noChangeAspect="1"/>
+            </wp:cNvGraphicFramePr>
+            <a:graphic xmlns:a="http://schemas.openxmlformats.org/drawingml/2006/main">
+              <a:graphicData uri="http://schemas.openxmlformats.org/drawingml/2006/picture">
+                <pic:pic xmlns:pic="http://schemas.openxmlformats.org/drawingml/2006/picture">
+                  <pic:nvPicPr>
+                    <pic:cNvPr id="0" name="Picture 7" descr="C:\Users\msi\Downloads\DermSCan ss\WhatsApp Image 2026-04-05 at 20.39.12 (1).jpeg"/>
+                    <pic:cNvPicPr>
+                      <a:picLocks noChangeAspect="1" noChangeArrowheads="1"/>
+                    </pic:cNvPicPr>
+                  </pic:nvPicPr>
+                  <pic:blipFill>
+                    <a:blip r:embed="rId12">
+                      <a:extLst>
+                        <a:ext uri="{28A0092B-C50C-407E-A947-70E740481C1C}">
+                          <a14:useLocalDpi xmlns:a14="http://schemas.microsoft.com/office/drawing/2010/main" val="0"/>
+                        </a:ext>
+                      </a:extLst>
+                    </a:blip>
+                    <a:srcRect/>
+                    <a:stretch>
+                      <a:fillRect/>
+                    </a:stretch>
+                  </pic:blipFill>
+                  <pic:spPr bwMode="auto">
+                    <a:xfrm>
+                      <a:off x="0" y="0"/>
+                      <a:ext cx="1796777" cy="3993655"/>
+                    </a:xfrm>
+                    <a:prstGeom prst="rect">
+                      <a:avLst/>
+                    </a:prstGeom>
+                    <a:noFill/>
+                    <a:ln>
+                      <a:noFill/>
+                    </a:ln>
+                  </pic:spPr>
+                </pic:pic>
+              </a:graphicData>
+            </a:graphic>
+            <wp14:sizeRelH relativeFrom="margin">
+              <wp14:pctWidth>0</wp14:pctWidth>
+            </wp14:sizeRelH>
+            <wp14:sizeRelV relativeFrom="margin">
+              <wp14:pctHeight>0</wp14:pctHeight>
+            </wp14:sizeRelV>
+          </wp:anchor>
+        </w:drawing>
+      </w:r>
+      <w:r>
+        <w:rPr>
+          <w:noProof/>
+          <w:lang w:val="en-GB" w:eastAsia="en-GB" w:bidi="si-LK"/>
+        </w:rPr>
+        <w:drawing>
+          <wp:anchor distT="0" distB="0" distL="114300" distR="114300" simplePos="0" relativeHeight="251648000" behindDoc="0" locked="0" layoutInCell="1" allowOverlap="1" wp14:anchorId="3FA32E40" wp14:editId="72321447">
+            <wp:simplePos x="0" y="0"/>
+            <wp:positionH relativeFrom="column">
+              <wp:posOffset>2194877</wp:posOffset>
+            </wp:positionH>
+            <wp:positionV relativeFrom="paragraph">
+              <wp:posOffset>5080</wp:posOffset>
+            </wp:positionV>
+            <wp:extent cx="1793795" cy="3986213"/>
+            <wp:effectExtent l="0" t="0" r="0" b="0"/>
+            <wp:wrapNone/>
+            <wp:docPr id="7" name="Picture 7" descr="C:\Users\msi\Downloads\DermSCan ss\WhatsApp Image 2026-04-05 at 20.39.12 (2).jpeg"/>
+            <wp:cNvGraphicFramePr>
+              <a:graphicFrameLocks xmlns:a="http://schemas.openxmlformats.org/drawingml/2006/main" noChangeAspect="1"/>
+            </wp:cNvGraphicFramePr>
+            <a:graphic xmlns:a="http://schemas.openxmlformats.org/drawingml/2006/main">
+              <a:graphicData uri="http://schemas.openxmlformats.org/drawingml/2006/picture">
+                <pic:pic xmlns:pic="http://schemas.openxmlformats.org/drawingml/2006/picture">
+                  <pic:nvPicPr>
+                    <pic:cNvPr id="0" name="Picture 6" descr="C:\Users\msi\Downloads\DermSCan ss\WhatsApp Image 2026-04-05 at 20.39.12 (2).jpeg"/>
+                    <pic:cNvPicPr>
+                      <a:picLocks noChangeAspect="1" noChangeArrowheads="1"/>
+                    </pic:cNvPicPr>
+                  </pic:nvPicPr>
+                  <pic:blipFill>
+                    <a:blip r:embed="rId13">
+                      <a:extLst>
+                        <a:ext uri="{28A0092B-C50C-407E-A947-70E740481C1C}">
+                          <a14:useLocalDpi xmlns:a14="http://schemas.microsoft.com/office/drawing/2010/main" val="0"/>
+                        </a:ext>
+                      </a:extLst>
+                    </a:blip>
+                    <a:srcRect/>
+                    <a:stretch>
+                      <a:fillRect/>
+                    </a:stretch>
+                  </pic:blipFill>
+                  <pic:spPr bwMode="auto">
+                    <a:xfrm>
+                      <a:off x="0" y="0"/>
+                      <a:ext cx="1793795" cy="3986213"/>
+                    </a:xfrm>
+                    <a:prstGeom prst="rect">
+                      <a:avLst/>
+                    </a:prstGeom>
+                    <a:noFill/>
+                    <a:ln>
+                      <a:noFill/>
+                    </a:ln>
+                  </pic:spPr>
+                </pic:pic>
+              </a:graphicData>
+            </a:graphic>
+            <wp14:sizeRelH relativeFrom="margin">
+              <wp14:pctWidth>0</wp14:pctWidth>
+            </wp14:sizeRelH>
+            <wp14:sizeRelV relativeFrom="margin">
+              <wp14:pctHeight>0</wp14:pctHeight>
+            </wp14:sizeRelV>
+          </wp:anchor>
+        </w:drawing>
+      </w:r>
+      <w:r>
+        <w:rPr>
+          <w:noProof/>
+          <w:lang w:val="en-GB" w:eastAsia="en-GB" w:bidi="si-LK"/>
+        </w:rPr>
+        <w:drawing>
+          <wp:anchor distT="0" distB="0" distL="114300" distR="114300" simplePos="0" relativeHeight="251637760" behindDoc="0" locked="0" layoutInCell="1" allowOverlap="1" wp14:anchorId="0640EF7E" wp14:editId="04306674">
+            <wp:simplePos x="0" y="0"/>
+            <wp:positionH relativeFrom="column">
+              <wp:posOffset>318</wp:posOffset>
+            </wp:positionH>
+            <wp:positionV relativeFrom="paragraph">
+              <wp:posOffset>3810</wp:posOffset>
+            </wp:positionV>
+            <wp:extent cx="1800225" cy="4001135"/>
+            <wp:effectExtent l="0" t="0" r="9525" b="0"/>
+            <wp:wrapNone/>
+            <wp:docPr id="6" name="Picture 6" descr="C:\Users\msi\Downloads\DermSCan ss\WhatsApp Image 2026-04-05 at 20.39.11.jpeg"/>
+            <wp:cNvGraphicFramePr>
+              <a:graphicFrameLocks xmlns:a="http://schemas.openxmlformats.org/drawingml/2006/main" noChangeAspect="1"/>
+            </wp:cNvGraphicFramePr>
+            <a:graphic xmlns:a="http://schemas.openxmlformats.org/drawingml/2006/main">
+              <a:graphicData uri="http://schemas.openxmlformats.org/drawingml/2006/picture">
+                <pic:pic xmlns:pic="http://schemas.openxmlformats.org/drawingml/2006/picture">
+                  <pic:nvPicPr>
+                    <pic:cNvPr id="0" name="Picture 5" descr="C:\Users\msi\Downloads\DermSCan ss\WhatsApp Image 2026-04-05 at 20.39.11.jpeg"/>
+                    <pic:cNvPicPr>
+                      <a:picLocks noChangeAspect="1" noChangeArrowheads="1"/>
+                    </pic:cNvPicPr>
+                  </pic:nvPicPr>
+                  <pic:blipFill>
+                    <a:blip r:embed="rId14">
+                      <a:extLst>
+                        <a:ext uri="{28A0092B-C50C-407E-A947-70E740481C1C}">
+                          <a14:useLocalDpi xmlns:a14="http://schemas.microsoft.com/office/drawing/2010/main" val="0"/>
+                        </a:ext>
+                      </a:extLst>
+                    </a:blip>
+                    <a:srcRect/>
+                    <a:stretch>
+                      <a:fillRect/>
+                    </a:stretch>
+                  </pic:blipFill>
+                  <pic:spPr bwMode="auto">
+                    <a:xfrm>
+                      <a:off x="0" y="0"/>
+                      <a:ext cx="1800225" cy="4001135"/>
+                    </a:xfrm>
+                    <a:prstGeom prst="rect">
+                      <a:avLst/>
+                    </a:prstGeom>
+                    <a:noFill/>
+                    <a:ln>
+                      <a:noFill/>
+                    </a:ln>
+                  </pic:spPr>
+                </pic:pic>
+              </a:graphicData>
+            </a:graphic>
+            <wp14:sizeRelH relativeFrom="margin">
+              <wp14:pctWidth>0</wp14:pctWidth>
+            </wp14:sizeRelH>
+            <wp14:sizeRelV relativeFrom="margin">
+              <wp14:pctHeight>0</wp14:pctHeight>
+            </wp14:sizeRelV>
+          </wp:anchor>
+        </w:drawing>
+      </w:r>
+    </w:p>
+    <w:p/>
+    <w:p/>
+    <w:p/>
+    <w:p/>
+    <w:p/>
+    <w:p/>
+    <w:p/>
+    <w:p/>
+    <w:p/>
+    <w:p/>
+    <w:p/>
+    <w:p/>
+    <w:p/>
     <w:p/>
     <w:p/>
     <w:p>
-      <w:bookmarkStart w:id="0" w:name="_GoBack"/>
-      <w:bookmarkEnd w:id="0"/>
+      <w:r>
+        <w:rPr>
+          <w:noProof/>
+          <w:lang w:val="en-GB" w:eastAsia="en-GB" w:bidi="si-LK"/>
+        </w:rPr>
+        <w:drawing>
+          <wp:anchor distT="0" distB="0" distL="114300" distR="114300" simplePos="0" relativeHeight="251669504" behindDoc="0" locked="0" layoutInCell="1" allowOverlap="1" wp14:anchorId="2605D45A" wp14:editId="48B054EA">
+            <wp:simplePos x="0" y="0"/>
+            <wp:positionH relativeFrom="column">
+              <wp:posOffset>751205</wp:posOffset>
+            </wp:positionH>
+            <wp:positionV relativeFrom="paragraph">
+              <wp:posOffset>6350</wp:posOffset>
+            </wp:positionV>
+            <wp:extent cx="1800225" cy="4000500"/>
+            <wp:effectExtent l="0" t="0" r="9525" b="0"/>
+            <wp:wrapNone/>
+            <wp:docPr id="9" name="Picture 9" descr="C:\Users\msi\Downloads\DermSCan ss\WhatsApp Image 2026-04-05 at 20.39.14.jpeg"/>
+            <wp:cNvGraphicFramePr>
+              <a:graphicFrameLocks xmlns:a="http://schemas.openxmlformats.org/drawingml/2006/main" noChangeAspect="1"/>
+            </wp:cNvGraphicFramePr>
+            <a:graphic xmlns:a="http://schemas.openxmlformats.org/drawingml/2006/main">
+              <a:graphicData uri="http://schemas.openxmlformats.org/drawingml/2006/picture">
+                <pic:pic xmlns:pic="http://schemas.openxmlformats.org/drawingml/2006/picture">
+                  <pic:nvPicPr>
+                    <pic:cNvPr id="0" name="Picture 8" descr="C:\Users\msi\Downloads\DermSCan ss\WhatsApp Image 2026-04-05 at 20.39.14.jpeg"/>
+                    <pic:cNvPicPr>
+                      <a:picLocks noChangeAspect="1" noChangeArrowheads="1"/>
+                    </pic:cNvPicPr>
+                  </pic:nvPicPr>
+                  <pic:blipFill>
+                    <a:blip r:embed="rId15">
+                      <a:extLst>
+                        <a:ext uri="{28A0092B-C50C-407E-A947-70E740481C1C}">
+                          <a14:useLocalDpi xmlns:a14="http://schemas.microsoft.com/office/drawing/2010/main" val="0"/>
+                        </a:ext>
+                      </a:extLst>
+                    </a:blip>
+                    <a:srcRect/>
+                    <a:stretch>
+                      <a:fillRect/>
+                    </a:stretch>
+                  </pic:blipFill>
+                  <pic:spPr bwMode="auto">
+                    <a:xfrm>
+                      <a:off x="0" y="0"/>
+                      <a:ext cx="1800225" cy="4000500"/>
+                    </a:xfrm>
+                    <a:prstGeom prst="rect">
+                      <a:avLst/>
+                    </a:prstGeom>
+                    <a:noFill/>
+                    <a:ln>
+                      <a:noFill/>
+                    </a:ln>
+                  </pic:spPr>
+                </pic:pic>
+              </a:graphicData>
+            </a:graphic>
+            <wp14:sizeRelH relativeFrom="margin">
+              <wp14:pctWidth>0</wp14:pctWidth>
+            </wp14:sizeRelH>
+            <wp14:sizeRelV relativeFrom="margin">
+              <wp14:pctHeight>0</wp14:pctHeight>
+            </wp14:sizeRelV>
+          </wp:anchor>
+        </w:drawing>
+      </w:r>
+      <w:r>
+        <w:rPr>
+          <w:noProof/>
+          <w:lang w:val="en-GB" w:eastAsia="en-GB" w:bidi="si-LK"/>
+        </w:rPr>
+        <w:drawing>
+          <wp:anchor distT="0" distB="0" distL="114300" distR="114300" simplePos="0" relativeHeight="251680768" behindDoc="0" locked="0" layoutInCell="1" allowOverlap="1" wp14:anchorId="53A08A58" wp14:editId="50E82E5B">
+            <wp:simplePos x="0" y="0"/>
+            <wp:positionH relativeFrom="column">
+              <wp:posOffset>3546792</wp:posOffset>
+            </wp:positionH>
+            <wp:positionV relativeFrom="paragraph">
+              <wp:posOffset>7303</wp:posOffset>
+            </wp:positionV>
+            <wp:extent cx="1778318" cy="3951817"/>
+            <wp:effectExtent l="0" t="0" r="0" b="0"/>
+            <wp:wrapNone/>
+            <wp:docPr id="10" name="Picture 10" descr="C:\Users\msi\Downloads\DermSCan ss\WhatsApp Image 2026-04-05 at 20.39.13.jpeg"/>
+            <wp:cNvGraphicFramePr>
+              <a:graphicFrameLocks xmlns:a="http://schemas.openxmlformats.org/drawingml/2006/main" noChangeAspect="1"/>
+            </wp:cNvGraphicFramePr>
+            <a:graphic xmlns:a="http://schemas.openxmlformats.org/drawingml/2006/main">
+              <a:graphicData uri="http://schemas.openxmlformats.org/drawingml/2006/picture">
+                <pic:pic xmlns:pic="http://schemas.openxmlformats.org/drawingml/2006/picture">
+                  <pic:nvPicPr>
+                    <pic:cNvPr id="0" name="Picture 9" descr="C:\Users\msi\Downloads\DermSCan ss\WhatsApp Image 2026-04-05 at 20.39.13.jpeg"/>
+                    <pic:cNvPicPr>
+                      <a:picLocks noChangeAspect="1" noChangeArrowheads="1"/>
+                    </pic:cNvPicPr>
+                  </pic:nvPicPr>
+                  <pic:blipFill>
+                    <a:blip r:embed="rId16">
+                      <a:extLst>
+                        <a:ext uri="{28A0092B-C50C-407E-A947-70E740481C1C}">
+                          <a14:useLocalDpi xmlns:a14="http://schemas.microsoft.com/office/drawing/2010/main" val="0"/>
+                        </a:ext>
+                      </a:extLst>
+                    </a:blip>
+                    <a:srcRect/>
+                    <a:stretch>
+                      <a:fillRect/>
+                    </a:stretch>
+                  </pic:blipFill>
+                  <pic:spPr bwMode="auto">
+                    <a:xfrm>
+                      <a:off x="0" y="0"/>
+                      <a:ext cx="1778318" cy="3951817"/>
+                    </a:xfrm>
+                    <a:prstGeom prst="rect">
+                      <a:avLst/>
+                    </a:prstGeom>
+                    <a:noFill/>
+                    <a:ln>
+                      <a:noFill/>
+                    </a:ln>
+                  </pic:spPr>
+                </pic:pic>
+              </a:graphicData>
+            </a:graphic>
+            <wp14:sizeRelH relativeFrom="margin">
+              <wp14:pctWidth>0</wp14:pctWidth>
+            </wp14:sizeRelH>
+            <wp14:sizeRelV relativeFrom="margin">
+              <wp14:pctHeight>0</wp14:pctHeight>
+            </wp14:sizeRelV>
+          </wp:anchor>
+        </w:drawing>
+      </w:r>
     </w:p>
+    <w:p/>
+    <w:p/>
+    <w:p/>
+    <w:p/>
+    <w:p/>
+    <w:p/>
+    <w:p/>
+    <w:p/>
+    <w:p/>
     <w:p/>
     <w:p/>
     <w:p>
@@ -876,6 +1312,7 @@
         <w:pStyle w:val="Heading2"/>
       </w:pPr>
       <w:r>
+        <w:lastRenderedPageBreak/>
         <w:t>Step 1: Create the mobile UI</w:t>
       </w:r>
     </w:p>
@@ -1034,7 +1471,6 @@
         <w:pStyle w:val="Heading1"/>
       </w:pPr>
       <w:r>
-        <w:lastRenderedPageBreak/>
         <w:t>6. Simple Conclusion</w:t>
       </w:r>
     </w:p>
@@ -12957,7 +13393,7 @@
 </file>
 
 <file path=customXml/itemProps1.xml><?xml version="1.0" encoding="utf-8"?>
-<ds:datastoreItem xmlns:ds="http://schemas.openxmlformats.org/officeDocument/2006/customXml" ds:itemID="{EEFC7255-10F7-45EB-8517-699B90B0EFB9}">
+<ds:datastoreItem xmlns:ds="http://schemas.openxmlformats.org/officeDocument/2006/customXml" ds:itemID="{B94D1DD0-6936-4A6D-99F1-F9D0144D794F}">
   <ds:schemaRefs>
     <ds:schemaRef ds:uri="http://schemas.openxmlformats.org/officeDocument/2006/bibliography"/>
   </ds:schemaRefs>

</xml_diff>